<commit_message>
docs: add unified 4-way comparison table of base model vs our model at 100 and 150 steps
</commit_message>
<xml_diff>
--- a/docs/Thesis_and_Poster_Complete_Master_Document.docx
+++ b/docs/Thesis_and_Poster_Complete_Master_Document.docx
@@ -2926,6 +2926,1761 @@
     </w:p>
     <w:p>
       <w:pPr>
+        <w:spacing w:before="240" w:after="60"/>
+      </w:pPr>
+      <w:r>
+        <w:rPr>
+          <w:rFonts w:ascii="Calibri" w:hAnsi="Calibri"/>
+          <w:b/>
+          <w:color w:val="2563EB"/>
+          <w:sz w:val="23"/>
+        </w:rPr>
+        <w:t>9.1 Direct Comparative Matrix: Base Model vs. Our Model (100 vs. 150 Steps)</w:t>
+      </w:r>
+    </w:p>
+    <w:p>
+      <w:pPr>
+        <w:spacing w:after="120" w:line="276" w:lineRule="auto"/>
+      </w:pPr>
+      <w:r>
+        <w:rPr>
+          <w:rFonts w:ascii="Calibri" w:hAnsi="Calibri"/>
+          <w:color w:val="0F172A"/>
+          <w:sz w:val="20"/>
+        </w:rPr>
+        <w:t>The following authoritative table provides the complete, unified head-to-head comparison of the Base Model (Standard RL-LoRA) and Our Model (HLoRA-RL) across both the 100-step pilot and the +50% scaled 150-step horizon:</w:t>
+      </w:r>
+    </w:p>
+    <w:tbl>
+      <w:tblPr>
+        <w:tblW w:type="auto" w:w="0"/>
+        <w:jc w:val="center"/>
+        <w:tblLook w:firstColumn="1" w:firstRow="1" w:lastColumn="0" w:lastRow="0" w:noHBand="0" w:noVBand="1" w:val="04A0"/>
+        <w:tblBorders>
+          <w:top w:val="single" w:sz="4" w:space="0" w:color="D1D5DB"/>
+          <w:bottom w:val="single" w:sz="4" w:space="0" w:color="D1D5DB"/>
+          <w:insideH w:val="single" w:sz="4" w:space="0" w:color="D1D5DB"/>
+          <w:insideV w:val="none"/>
+          <w:left w:val="none"/>
+          <w:right w:val="none"/>
+        </w:tblBorders>
+      </w:tblPr>
+      <w:tblGrid>
+        <w:gridCol w:w="1656"/>
+        <w:gridCol w:w="1656"/>
+        <w:gridCol w:w="1656"/>
+        <w:gridCol w:w="1656"/>
+        <w:gridCol w:w="1656"/>
+        <w:gridCol w:w="1656"/>
+      </w:tblGrid>
+      <w:tr>
+        <w:tc>
+          <w:tcPr>
+            <w:tcW w:type="dxa" w:w="2880"/>
+            <w:shd w:fill="1E3A8A"/>
+            <w:tcMar>
+              <w:top w:w="140" w:type="dxa"/>
+              <w:bottom w:w="140" w:type="dxa"/>
+              <w:left w:w="160" w:type="dxa"/>
+              <w:right w:w="160" w:type="dxa"/>
+            </w:tcMar>
+            <w:vAlign w:val="center"/>
+          </w:tcPr>
+          <w:p>
+            <w:pPr>
+              <w:jc w:val="left"/>
+            </w:pPr>
+            <w:r>
+              <w:rPr>
+                <w:rFonts w:ascii="Calibri" w:hAnsi="Calibri"/>
+                <w:b/>
+                <w:color w:val="FFFFFF"/>
+                <w:sz w:val="19"/>
+              </w:rPr>
+              <w:t>Evaluation Metric / Benchmark</w:t>
+            </w:r>
+          </w:p>
+        </w:tc>
+        <w:tc>
+          <w:tcPr>
+            <w:tcW w:type="dxa" w:w="1296"/>
+            <w:shd w:fill="1E3A8A"/>
+            <w:tcMar>
+              <w:top w:w="140" w:type="dxa"/>
+              <w:bottom w:w="140" w:type="dxa"/>
+              <w:left w:w="160" w:type="dxa"/>
+              <w:right w:w="160" w:type="dxa"/>
+            </w:tcMar>
+            <w:vAlign w:val="center"/>
+          </w:tcPr>
+          <w:p>
+            <w:pPr>
+              <w:jc w:val="center"/>
+            </w:pPr>
+            <w:r>
+              <w:rPr>
+                <w:rFonts w:ascii="Calibri" w:hAnsi="Calibri"/>
+                <w:b/>
+                <w:color w:val="FFFFFF"/>
+                <w:sz w:val="19"/>
+              </w:rPr>
+              <w:t>Base Model</w:t>
+              <w:br/>
+              <w:t>(100 Steps)</w:t>
+            </w:r>
+          </w:p>
+        </w:tc>
+        <w:tc>
+          <w:tcPr>
+            <w:tcW w:type="dxa" w:w="1296"/>
+            <w:shd w:fill="1E3A8A"/>
+            <w:tcMar>
+              <w:top w:w="140" w:type="dxa"/>
+              <w:bottom w:w="140" w:type="dxa"/>
+              <w:left w:w="160" w:type="dxa"/>
+              <w:right w:w="160" w:type="dxa"/>
+            </w:tcMar>
+            <w:vAlign w:val="center"/>
+          </w:tcPr>
+          <w:p>
+            <w:pPr>
+              <w:jc w:val="center"/>
+            </w:pPr>
+            <w:r>
+              <w:rPr>
+                <w:rFonts w:ascii="Calibri" w:hAnsi="Calibri"/>
+                <w:b/>
+                <w:color w:val="FFFFFF"/>
+                <w:sz w:val="19"/>
+              </w:rPr>
+              <w:t>Base Model</w:t>
+              <w:br/>
+              <w:t>(150 Steps)</w:t>
+            </w:r>
+          </w:p>
+        </w:tc>
+        <w:tc>
+          <w:tcPr>
+            <w:tcW w:type="dxa" w:w="1296"/>
+            <w:shd w:fill="1E3A8A"/>
+            <w:tcMar>
+              <w:top w:w="140" w:type="dxa"/>
+              <w:bottom w:w="140" w:type="dxa"/>
+              <w:left w:w="160" w:type="dxa"/>
+              <w:right w:w="160" w:type="dxa"/>
+            </w:tcMar>
+            <w:vAlign w:val="center"/>
+          </w:tcPr>
+          <w:p>
+            <w:pPr>
+              <w:jc w:val="center"/>
+            </w:pPr>
+            <w:r>
+              <w:rPr>
+                <w:rFonts w:ascii="Calibri" w:hAnsi="Calibri"/>
+                <w:b/>
+                <w:color w:val="FFFFFF"/>
+                <w:sz w:val="19"/>
+              </w:rPr>
+              <w:t>Our Model</w:t>
+              <w:br/>
+              <w:t>(100 Steps)</w:t>
+            </w:r>
+          </w:p>
+        </w:tc>
+        <w:tc>
+          <w:tcPr>
+            <w:tcW w:type="dxa" w:w="1296"/>
+            <w:shd w:fill="1E3A8A"/>
+            <w:tcMar>
+              <w:top w:w="140" w:type="dxa"/>
+              <w:bottom w:w="140" w:type="dxa"/>
+              <w:left w:w="160" w:type="dxa"/>
+              <w:right w:w="160" w:type="dxa"/>
+            </w:tcMar>
+            <w:vAlign w:val="center"/>
+          </w:tcPr>
+          <w:p>
+            <w:pPr>
+              <w:jc w:val="center"/>
+            </w:pPr>
+            <w:r>
+              <w:rPr>
+                <w:rFonts w:ascii="Calibri" w:hAnsi="Calibri"/>
+                <w:b/>
+                <w:color w:val="FFFFFF"/>
+                <w:sz w:val="19"/>
+              </w:rPr>
+              <w:t>Our Model</w:t>
+              <w:br/>
+              <w:t>(150 Steps)</w:t>
+            </w:r>
+          </w:p>
+        </w:tc>
+        <w:tc>
+          <w:tcPr>
+            <w:tcW w:type="dxa" w:w="1728"/>
+            <w:shd w:fill="1E3A8A"/>
+            <w:tcMar>
+              <w:top w:w="140" w:type="dxa"/>
+              <w:bottom w:w="140" w:type="dxa"/>
+              <w:left w:w="160" w:type="dxa"/>
+              <w:right w:w="160" w:type="dxa"/>
+            </w:tcMar>
+            <w:vAlign w:val="center"/>
+          </w:tcPr>
+          <w:p>
+            <w:pPr>
+              <w:jc w:val="center"/>
+            </w:pPr>
+            <w:r>
+              <w:rPr>
+                <w:rFonts w:ascii="Calibri" w:hAnsi="Calibri"/>
+                <w:b/>
+                <w:color w:val="FFFFFF"/>
+                <w:sz w:val="19"/>
+              </w:rPr>
+              <w:t>Scientific</w:t>
+              <w:br/>
+              <w:t>Advantage</w:t>
+            </w:r>
+          </w:p>
+        </w:tc>
+      </w:tr>
+      <w:tr>
+        <w:tc>
+          <w:tcPr>
+            <w:tcW w:type="dxa" w:w="2880"/>
+            <w:shd w:fill="FFFFFF"/>
+            <w:tcMar>
+              <w:top w:w="100" w:type="dxa"/>
+              <w:bottom w:w="100" w:type="dxa"/>
+              <w:left w:w="160" w:type="dxa"/>
+              <w:right w:w="160" w:type="dxa"/>
+            </w:tcMar>
+            <w:vAlign w:val="center"/>
+          </w:tcPr>
+          <w:p>
+            <w:pPr>
+              <w:jc w:val="left"/>
+            </w:pPr>
+            <w:r>
+              <w:rPr>
+                <w:rFonts w:ascii="Calibri" w:hAnsi="Calibri"/>
+                <w:sz w:val="19"/>
+              </w:rPr>
+              <w:t>Task 1 Peak Science (ARC-Challenge)</w:t>
+            </w:r>
+          </w:p>
+        </w:tc>
+        <w:tc>
+          <w:tcPr>
+            <w:tcW w:type="dxa" w:w="1296"/>
+            <w:shd w:fill="FFFFFF"/>
+            <w:tcMar>
+              <w:top w:w="100" w:type="dxa"/>
+              <w:bottom w:w="100" w:type="dxa"/>
+              <w:left w:w="160" w:type="dxa"/>
+              <w:right w:w="160" w:type="dxa"/>
+            </w:tcMar>
+            <w:vAlign w:val="center"/>
+          </w:tcPr>
+          <w:p>
+            <w:pPr>
+              <w:jc w:val="center"/>
+            </w:pPr>
+            <w:r>
+              <w:rPr>
+                <w:rFonts w:ascii="Calibri" w:hAnsi="Calibri"/>
+                <w:sz w:val="19"/>
+              </w:rPr>
+              <w:t>76.56%</w:t>
+            </w:r>
+          </w:p>
+        </w:tc>
+        <w:tc>
+          <w:tcPr>
+            <w:tcW w:type="dxa" w:w="1296"/>
+            <w:shd w:fill="FFFFFF"/>
+            <w:tcMar>
+              <w:top w:w="100" w:type="dxa"/>
+              <w:bottom w:w="100" w:type="dxa"/>
+              <w:left w:w="160" w:type="dxa"/>
+              <w:right w:w="160" w:type="dxa"/>
+            </w:tcMar>
+            <w:vAlign w:val="center"/>
+          </w:tcPr>
+          <w:p>
+            <w:pPr>
+              <w:jc w:val="center"/>
+            </w:pPr>
+            <w:r>
+              <w:rPr>
+                <w:rFonts w:ascii="Calibri" w:hAnsi="Calibri"/>
+                <w:sz w:val="19"/>
+              </w:rPr>
+              <w:t>82.81%</w:t>
+            </w:r>
+          </w:p>
+        </w:tc>
+        <w:tc>
+          <w:tcPr>
+            <w:tcW w:type="dxa" w:w="1296"/>
+            <w:shd w:fill="FFFFFF"/>
+            <w:tcMar>
+              <w:top w:w="100" w:type="dxa"/>
+              <w:bottom w:w="100" w:type="dxa"/>
+              <w:left w:w="160" w:type="dxa"/>
+              <w:right w:w="160" w:type="dxa"/>
+            </w:tcMar>
+            <w:vAlign w:val="center"/>
+          </w:tcPr>
+          <w:p>
+            <w:pPr>
+              <w:jc w:val="center"/>
+            </w:pPr>
+            <w:r>
+              <w:rPr>
+                <w:rFonts w:ascii="Calibri" w:hAnsi="Calibri"/>
+                <w:sz w:val="19"/>
+              </w:rPr>
+              <w:t>76.56%</w:t>
+            </w:r>
+          </w:p>
+        </w:tc>
+        <w:tc>
+          <w:tcPr>
+            <w:tcW w:type="dxa" w:w="1296"/>
+            <w:shd w:fill="FFFFFF"/>
+            <w:tcMar>
+              <w:top w:w="100" w:type="dxa"/>
+              <w:bottom w:w="100" w:type="dxa"/>
+              <w:left w:w="160" w:type="dxa"/>
+              <w:right w:w="160" w:type="dxa"/>
+            </w:tcMar>
+            <w:vAlign w:val="center"/>
+          </w:tcPr>
+          <w:p>
+            <w:pPr>
+              <w:jc w:val="center"/>
+            </w:pPr>
+            <w:r>
+              <w:rPr>
+                <w:rFonts w:ascii="Calibri" w:hAnsi="Calibri"/>
+                <w:sz w:val="19"/>
+              </w:rPr>
+              <w:t>82.81%</w:t>
+            </w:r>
+          </w:p>
+        </w:tc>
+        <w:tc>
+          <w:tcPr>
+            <w:tcW w:type="dxa" w:w="1728"/>
+            <w:shd w:fill="FFFFFF"/>
+            <w:tcMar>
+              <w:top w:w="100" w:type="dxa"/>
+              <w:bottom w:w="100" w:type="dxa"/>
+              <w:left w:w="160" w:type="dxa"/>
+              <w:right w:w="160" w:type="dxa"/>
+            </w:tcMar>
+            <w:vAlign w:val="center"/>
+          </w:tcPr>
+          <w:p>
+            <w:pPr>
+              <w:jc w:val="center"/>
+            </w:pPr>
+            <w:r>
+              <w:rPr>
+                <w:rFonts w:ascii="Calibri" w:hAnsi="Calibri"/>
+                <w:sz w:val="19"/>
+              </w:rPr>
+              <w:t>Identical baseline match</w:t>
+            </w:r>
+          </w:p>
+        </w:tc>
+      </w:tr>
+      <w:tr>
+        <w:tc>
+          <w:tcPr>
+            <w:tcW w:type="dxa" w:w="2880"/>
+            <w:shd w:fill="F8FAFC"/>
+            <w:tcMar>
+              <w:top w:w="100" w:type="dxa"/>
+              <w:bottom w:w="100" w:type="dxa"/>
+              <w:left w:w="160" w:type="dxa"/>
+              <w:right w:w="160" w:type="dxa"/>
+            </w:tcMar>
+            <w:vAlign w:val="center"/>
+          </w:tcPr>
+          <w:p>
+            <w:pPr>
+              <w:jc w:val="left"/>
+            </w:pPr>
+            <w:r>
+              <w:rPr>
+                <w:rFonts w:ascii="Calibri" w:hAnsi="Calibri"/>
+                <w:sz w:val="19"/>
+              </w:rPr>
+              <w:t>Task 1 Retained Science (Post-Math)</w:t>
+            </w:r>
+          </w:p>
+        </w:tc>
+        <w:tc>
+          <w:tcPr>
+            <w:tcW w:type="dxa" w:w="1296"/>
+            <w:shd w:fill="F8FAFC"/>
+            <w:tcMar>
+              <w:top w:w="100" w:type="dxa"/>
+              <w:bottom w:w="100" w:type="dxa"/>
+              <w:left w:w="160" w:type="dxa"/>
+              <w:right w:w="160" w:type="dxa"/>
+            </w:tcMar>
+            <w:vAlign w:val="center"/>
+          </w:tcPr>
+          <w:p>
+            <w:pPr>
+              <w:jc w:val="center"/>
+            </w:pPr>
+            <w:r>
+              <w:rPr>
+                <w:rFonts w:ascii="Calibri" w:hAnsi="Calibri"/>
+                <w:sz w:val="19"/>
+              </w:rPr>
+              <w:t>76.56%</w:t>
+            </w:r>
+          </w:p>
+        </w:tc>
+        <w:tc>
+          <w:tcPr>
+            <w:tcW w:type="dxa" w:w="1296"/>
+            <w:shd w:fill="F8FAFC"/>
+            <w:tcMar>
+              <w:top w:w="100" w:type="dxa"/>
+              <w:bottom w:w="100" w:type="dxa"/>
+              <w:left w:w="160" w:type="dxa"/>
+              <w:right w:w="160" w:type="dxa"/>
+            </w:tcMar>
+            <w:vAlign w:val="center"/>
+          </w:tcPr>
+          <w:p>
+            <w:pPr>
+              <w:jc w:val="center"/>
+            </w:pPr>
+            <w:r>
+              <w:rPr>
+                <w:rFonts w:ascii="Calibri" w:hAnsi="Calibri"/>
+                <w:sz w:val="19"/>
+              </w:rPr>
+              <w:t>79.69%</w:t>
+            </w:r>
+          </w:p>
+        </w:tc>
+        <w:tc>
+          <w:tcPr>
+            <w:tcW w:type="dxa" w:w="1296"/>
+            <w:shd w:fill="F8FAFC"/>
+            <w:tcMar>
+              <w:top w:w="100" w:type="dxa"/>
+              <w:bottom w:w="100" w:type="dxa"/>
+              <w:left w:w="160" w:type="dxa"/>
+              <w:right w:w="160" w:type="dxa"/>
+            </w:tcMar>
+            <w:vAlign w:val="center"/>
+          </w:tcPr>
+          <w:p>
+            <w:pPr>
+              <w:jc w:val="center"/>
+            </w:pPr>
+            <w:r>
+              <w:rPr>
+                <w:rFonts w:ascii="Calibri" w:hAnsi="Calibri"/>
+                <w:sz w:val="19"/>
+              </w:rPr>
+              <w:t>75.00%</w:t>
+            </w:r>
+          </w:p>
+        </w:tc>
+        <w:tc>
+          <w:tcPr>
+            <w:tcW w:type="dxa" w:w="1296"/>
+            <w:shd w:fill="DCFCE7"/>
+            <w:tcMar>
+              <w:top w:w="100" w:type="dxa"/>
+              <w:bottom w:w="100" w:type="dxa"/>
+              <w:left w:w="160" w:type="dxa"/>
+              <w:right w:w="160" w:type="dxa"/>
+            </w:tcMar>
+            <w:vAlign w:val="center"/>
+          </w:tcPr>
+          <w:p>
+            <w:pPr>
+              <w:jc w:val="center"/>
+            </w:pPr>
+            <w:r>
+              <w:rPr>
+                <w:rFonts w:ascii="Calibri" w:hAnsi="Calibri"/>
+                <w:b/>
+                <w:color w:val="15803D"/>
+                <w:sz w:val="19"/>
+              </w:rPr>
+              <w:t>79.69%</w:t>
+            </w:r>
+          </w:p>
+        </w:tc>
+        <w:tc>
+          <w:tcPr>
+            <w:tcW w:type="dxa" w:w="1728"/>
+            <w:shd w:fill="F8FAFC"/>
+            <w:tcMar>
+              <w:top w:w="100" w:type="dxa"/>
+              <w:bottom w:w="100" w:type="dxa"/>
+              <w:left w:w="160" w:type="dxa"/>
+              <w:right w:w="160" w:type="dxa"/>
+            </w:tcMar>
+            <w:vAlign w:val="center"/>
+          </w:tcPr>
+          <w:p>
+            <w:pPr>
+              <w:jc w:val="center"/>
+            </w:pPr>
+            <w:r>
+              <w:rPr>
+                <w:rFonts w:ascii="Calibri" w:hAnsi="Calibri"/>
+                <w:sz w:val="19"/>
+              </w:rPr>
+              <w:t>96.2% science retained</w:t>
+            </w:r>
+          </w:p>
+        </w:tc>
+      </w:tr>
+      <w:tr>
+        <w:tc>
+          <w:tcPr>
+            <w:tcW w:type="dxa" w:w="2880"/>
+            <w:shd w:fill="FFFFFF"/>
+            <w:tcMar>
+              <w:top w:w="100" w:type="dxa"/>
+              <w:bottom w:w="100" w:type="dxa"/>
+              <w:left w:w="160" w:type="dxa"/>
+              <w:right w:w="160" w:type="dxa"/>
+            </w:tcMar>
+            <w:vAlign w:val="center"/>
+          </w:tcPr>
+          <w:p>
+            <w:pPr>
+              <w:jc w:val="left"/>
+            </w:pPr>
+            <w:r>
+              <w:rPr>
+                <w:rFonts w:ascii="Calibri" w:hAnsi="Calibri"/>
+                <w:sz w:val="19"/>
+              </w:rPr>
+              <w:t>Task 1 Catastrophic Forgetting</w:t>
+            </w:r>
+          </w:p>
+        </w:tc>
+        <w:tc>
+          <w:tcPr>
+            <w:tcW w:type="dxa" w:w="1296"/>
+            <w:shd w:fill="FFFFFF"/>
+            <w:tcMar>
+              <w:top w:w="100" w:type="dxa"/>
+              <w:bottom w:w="100" w:type="dxa"/>
+              <w:left w:w="160" w:type="dxa"/>
+              <w:right w:w="160" w:type="dxa"/>
+            </w:tcMar>
+            <w:vAlign w:val="center"/>
+          </w:tcPr>
+          <w:p>
+            <w:pPr>
+              <w:jc w:val="center"/>
+            </w:pPr>
+            <w:r>
+              <w:rPr>
+                <w:rFonts w:ascii="Calibri" w:hAnsi="Calibri"/>
+                <w:sz w:val="19"/>
+              </w:rPr>
+              <w:t>0.00 pp</w:t>
+            </w:r>
+          </w:p>
+        </w:tc>
+        <w:tc>
+          <w:tcPr>
+            <w:tcW w:type="dxa" w:w="1296"/>
+            <w:shd w:fill="FFFFFF"/>
+            <w:tcMar>
+              <w:top w:w="100" w:type="dxa"/>
+              <w:bottom w:w="100" w:type="dxa"/>
+              <w:left w:w="160" w:type="dxa"/>
+              <w:right w:w="160" w:type="dxa"/>
+            </w:tcMar>
+            <w:vAlign w:val="center"/>
+          </w:tcPr>
+          <w:p>
+            <w:pPr>
+              <w:jc w:val="center"/>
+            </w:pPr>
+            <w:r>
+              <w:rPr>
+                <w:rFonts w:ascii="Calibri" w:hAnsi="Calibri"/>
+                <w:sz w:val="19"/>
+              </w:rPr>
+              <w:t>3.12 pp</w:t>
+            </w:r>
+          </w:p>
+        </w:tc>
+        <w:tc>
+          <w:tcPr>
+            <w:tcW w:type="dxa" w:w="1296"/>
+            <w:shd w:fill="FFFFFF"/>
+            <w:tcMar>
+              <w:top w:w="100" w:type="dxa"/>
+              <w:bottom w:w="100" w:type="dxa"/>
+              <w:left w:w="160" w:type="dxa"/>
+              <w:right w:w="160" w:type="dxa"/>
+            </w:tcMar>
+            <w:vAlign w:val="center"/>
+          </w:tcPr>
+          <w:p>
+            <w:pPr>
+              <w:jc w:val="center"/>
+            </w:pPr>
+            <w:r>
+              <w:rPr>
+                <w:rFonts w:ascii="Calibri" w:hAnsi="Calibri"/>
+                <w:sz w:val="19"/>
+              </w:rPr>
+              <w:t>1.56 pp</w:t>
+            </w:r>
+          </w:p>
+        </w:tc>
+        <w:tc>
+          <w:tcPr>
+            <w:tcW w:type="dxa" w:w="1296"/>
+            <w:shd w:fill="FFFFFF"/>
+            <w:tcMar>
+              <w:top w:w="100" w:type="dxa"/>
+              <w:bottom w:w="100" w:type="dxa"/>
+              <w:left w:w="160" w:type="dxa"/>
+              <w:right w:w="160" w:type="dxa"/>
+            </w:tcMar>
+            <w:vAlign w:val="center"/>
+          </w:tcPr>
+          <w:p>
+            <w:pPr>
+              <w:jc w:val="center"/>
+            </w:pPr>
+            <w:r>
+              <w:rPr>
+                <w:rFonts w:ascii="Calibri" w:hAnsi="Calibri"/>
+                <w:sz w:val="19"/>
+              </w:rPr>
+              <w:t>3.12 pp</w:t>
+            </w:r>
+          </w:p>
+        </w:tc>
+        <w:tc>
+          <w:tcPr>
+            <w:tcW w:type="dxa" w:w="1728"/>
+            <w:shd w:fill="FFFFFF"/>
+            <w:tcMar>
+              <w:top w:w="100" w:type="dxa"/>
+              <w:bottom w:w="100" w:type="dxa"/>
+              <w:left w:w="160" w:type="dxa"/>
+              <w:right w:w="160" w:type="dxa"/>
+            </w:tcMar>
+            <w:vAlign w:val="center"/>
+          </w:tcPr>
+          <w:p>
+            <w:pPr>
+              <w:jc w:val="center"/>
+            </w:pPr>
+            <w:r>
+              <w:rPr>
+                <w:rFonts w:ascii="Calibri" w:hAnsi="Calibri"/>
+                <w:sz w:val="19"/>
+              </w:rPr>
+              <w:t>Equal high stability</w:t>
+            </w:r>
+          </w:p>
+        </w:tc>
+      </w:tr>
+      <w:tr>
+        <w:tc>
+          <w:tcPr>
+            <w:tcW w:type="dxa" w:w="2880"/>
+            <w:shd w:fill="F8FAFC"/>
+            <w:tcMar>
+              <w:top w:w="100" w:type="dxa"/>
+              <w:bottom w:w="100" w:type="dxa"/>
+              <w:left w:w="160" w:type="dxa"/>
+              <w:right w:w="160" w:type="dxa"/>
+            </w:tcMar>
+            <w:vAlign w:val="center"/>
+          </w:tcPr>
+          <w:p>
+            <w:pPr>
+              <w:jc w:val="left"/>
+            </w:pPr>
+            <w:r>
+              <w:rPr>
+                <w:rFonts w:ascii="Calibri" w:hAnsi="Calibri"/>
+                <w:sz w:val="19"/>
+              </w:rPr>
+              <w:t>Task 2 Math Learning (GSM8K)</w:t>
+            </w:r>
+          </w:p>
+        </w:tc>
+        <w:tc>
+          <w:tcPr>
+            <w:tcW w:type="dxa" w:w="1296"/>
+            <w:shd w:fill="F8FAFC"/>
+            <w:tcMar>
+              <w:top w:w="100" w:type="dxa"/>
+              <w:bottom w:w="100" w:type="dxa"/>
+              <w:left w:w="160" w:type="dxa"/>
+              <w:right w:w="160" w:type="dxa"/>
+            </w:tcMar>
+            <w:vAlign w:val="center"/>
+          </w:tcPr>
+          <w:p>
+            <w:pPr>
+              <w:jc w:val="center"/>
+            </w:pPr>
+            <w:r>
+              <w:rPr>
+                <w:rFonts w:ascii="Calibri" w:hAnsi="Calibri"/>
+                <w:sz w:val="19"/>
+              </w:rPr>
+              <w:t>1.56%</w:t>
+            </w:r>
+          </w:p>
+        </w:tc>
+        <w:tc>
+          <w:tcPr>
+            <w:tcW w:type="dxa" w:w="1296"/>
+            <w:shd w:fill="F8FAFC"/>
+            <w:tcMar>
+              <w:top w:w="100" w:type="dxa"/>
+              <w:bottom w:w="100" w:type="dxa"/>
+              <w:left w:w="160" w:type="dxa"/>
+              <w:right w:w="160" w:type="dxa"/>
+            </w:tcMar>
+            <w:vAlign w:val="center"/>
+          </w:tcPr>
+          <w:p>
+            <w:pPr>
+              <w:jc w:val="center"/>
+            </w:pPr>
+            <w:r>
+              <w:rPr>
+                <w:rFonts w:ascii="Calibri" w:hAnsi="Calibri"/>
+                <w:sz w:val="19"/>
+              </w:rPr>
+              <w:t>3.12%</w:t>
+            </w:r>
+          </w:p>
+        </w:tc>
+        <w:tc>
+          <w:tcPr>
+            <w:tcW w:type="dxa" w:w="1296"/>
+            <w:shd w:fill="F8FAFC"/>
+            <w:tcMar>
+              <w:top w:w="100" w:type="dxa"/>
+              <w:bottom w:w="100" w:type="dxa"/>
+              <w:left w:w="160" w:type="dxa"/>
+              <w:right w:w="160" w:type="dxa"/>
+            </w:tcMar>
+            <w:vAlign w:val="center"/>
+          </w:tcPr>
+          <w:p>
+            <w:pPr>
+              <w:jc w:val="center"/>
+            </w:pPr>
+            <w:r>
+              <w:rPr>
+                <w:rFonts w:ascii="Calibri" w:hAnsi="Calibri"/>
+                <w:sz w:val="19"/>
+              </w:rPr>
+              <w:t>15.62%</w:t>
+            </w:r>
+          </w:p>
+        </w:tc>
+        <w:tc>
+          <w:tcPr>
+            <w:tcW w:type="dxa" w:w="1296"/>
+            <w:shd w:fill="DCFCE7"/>
+            <w:tcMar>
+              <w:top w:w="100" w:type="dxa"/>
+              <w:bottom w:w="100" w:type="dxa"/>
+              <w:left w:w="160" w:type="dxa"/>
+              <w:right w:w="160" w:type="dxa"/>
+            </w:tcMar>
+            <w:vAlign w:val="center"/>
+          </w:tcPr>
+          <w:p>
+            <w:pPr>
+              <w:jc w:val="center"/>
+            </w:pPr>
+            <w:r>
+              <w:rPr>
+                <w:rFonts w:ascii="Calibri" w:hAnsi="Calibri"/>
+                <w:b/>
+                <w:color w:val="15803D"/>
+                <w:sz w:val="19"/>
+              </w:rPr>
+              <w:t>32.81%</w:t>
+            </w:r>
+          </w:p>
+        </w:tc>
+        <w:tc>
+          <w:tcPr>
+            <w:tcW w:type="dxa" w:w="1728"/>
+            <w:shd w:fill="F8FAFC"/>
+            <w:tcMar>
+              <w:top w:w="100" w:type="dxa"/>
+              <w:bottom w:w="100" w:type="dxa"/>
+              <w:left w:w="160" w:type="dxa"/>
+              <w:right w:w="160" w:type="dxa"/>
+            </w:tcMar>
+            <w:vAlign w:val="center"/>
+          </w:tcPr>
+          <w:p>
+            <w:pPr>
+              <w:jc w:val="center"/>
+            </w:pPr>
+            <w:r>
+              <w:rPr>
+                <w:rFonts w:ascii="Calibri" w:hAnsi="Calibri"/>
+                <w:sz w:val="19"/>
+              </w:rPr>
+              <w:t>10.5x Advantage (Doubled!)</w:t>
+            </w:r>
+          </w:p>
+        </w:tc>
+      </w:tr>
+      <w:tr>
+        <w:tc>
+          <w:tcPr>
+            <w:tcW w:type="dxa" w:w="2880"/>
+            <w:shd w:fill="FFFFFF"/>
+            <w:tcMar>
+              <w:top w:w="100" w:type="dxa"/>
+              <w:bottom w:w="100" w:type="dxa"/>
+              <w:left w:w="160" w:type="dxa"/>
+              <w:right w:w="160" w:type="dxa"/>
+            </w:tcMar>
+            <w:vAlign w:val="center"/>
+          </w:tcPr>
+          <w:p>
+            <w:pPr>
+              <w:jc w:val="left"/>
+            </w:pPr>
+            <w:r>
+              <w:rPr>
+                <w:rFonts w:ascii="Calibri" w:hAnsi="Calibri"/>
+                <w:sz w:val="19"/>
+              </w:rPr>
+              <w:t>Continual Average Performance</w:t>
+            </w:r>
+          </w:p>
+        </w:tc>
+        <w:tc>
+          <w:tcPr>
+            <w:tcW w:type="dxa" w:w="1296"/>
+            <w:shd w:fill="FFFFFF"/>
+            <w:tcMar>
+              <w:top w:w="100" w:type="dxa"/>
+              <w:bottom w:w="100" w:type="dxa"/>
+              <w:left w:w="160" w:type="dxa"/>
+              <w:right w:w="160" w:type="dxa"/>
+            </w:tcMar>
+            <w:vAlign w:val="center"/>
+          </w:tcPr>
+          <w:p>
+            <w:pPr>
+              <w:jc w:val="center"/>
+            </w:pPr>
+            <w:r>
+              <w:rPr>
+                <w:rFonts w:ascii="Calibri" w:hAnsi="Calibri"/>
+                <w:sz w:val="19"/>
+              </w:rPr>
+              <w:t>39.06%</w:t>
+            </w:r>
+          </w:p>
+        </w:tc>
+        <w:tc>
+          <w:tcPr>
+            <w:tcW w:type="dxa" w:w="1296"/>
+            <w:shd w:fill="FFFFFF"/>
+            <w:tcMar>
+              <w:top w:w="100" w:type="dxa"/>
+              <w:bottom w:w="100" w:type="dxa"/>
+              <w:left w:w="160" w:type="dxa"/>
+              <w:right w:w="160" w:type="dxa"/>
+            </w:tcMar>
+            <w:vAlign w:val="center"/>
+          </w:tcPr>
+          <w:p>
+            <w:pPr>
+              <w:jc w:val="center"/>
+            </w:pPr>
+            <w:r>
+              <w:rPr>
+                <w:rFonts w:ascii="Calibri" w:hAnsi="Calibri"/>
+                <w:sz w:val="19"/>
+              </w:rPr>
+              <w:t>41.41%</w:t>
+            </w:r>
+          </w:p>
+        </w:tc>
+        <w:tc>
+          <w:tcPr>
+            <w:tcW w:type="dxa" w:w="1296"/>
+            <w:shd w:fill="FFFFFF"/>
+            <w:tcMar>
+              <w:top w:w="100" w:type="dxa"/>
+              <w:bottom w:w="100" w:type="dxa"/>
+              <w:left w:w="160" w:type="dxa"/>
+              <w:right w:w="160" w:type="dxa"/>
+            </w:tcMar>
+            <w:vAlign w:val="center"/>
+          </w:tcPr>
+          <w:p>
+            <w:pPr>
+              <w:jc w:val="center"/>
+            </w:pPr>
+            <w:r>
+              <w:rPr>
+                <w:rFonts w:ascii="Calibri" w:hAnsi="Calibri"/>
+                <w:sz w:val="19"/>
+              </w:rPr>
+              <w:t>45.31%</w:t>
+            </w:r>
+          </w:p>
+        </w:tc>
+        <w:tc>
+          <w:tcPr>
+            <w:tcW w:type="dxa" w:w="1296"/>
+            <w:shd w:fill="DCFCE7"/>
+            <w:tcMar>
+              <w:top w:w="100" w:type="dxa"/>
+              <w:bottom w:w="100" w:type="dxa"/>
+              <w:left w:w="160" w:type="dxa"/>
+              <w:right w:w="160" w:type="dxa"/>
+            </w:tcMar>
+            <w:vAlign w:val="center"/>
+          </w:tcPr>
+          <w:p>
+            <w:pPr>
+              <w:jc w:val="center"/>
+            </w:pPr>
+            <w:r>
+              <w:rPr>
+                <w:rFonts w:ascii="Calibri" w:hAnsi="Calibri"/>
+                <w:b/>
+                <w:color w:val="15803D"/>
+                <w:sz w:val="19"/>
+              </w:rPr>
+              <w:t>56.25%</w:t>
+            </w:r>
+          </w:p>
+        </w:tc>
+        <w:tc>
+          <w:tcPr>
+            <w:tcW w:type="dxa" w:w="1728"/>
+            <w:shd w:fill="FFFFFF"/>
+            <w:tcMar>
+              <w:top w:w="100" w:type="dxa"/>
+              <w:bottom w:w="100" w:type="dxa"/>
+              <w:left w:w="160" w:type="dxa"/>
+              <w:right w:w="160" w:type="dxa"/>
+            </w:tcMar>
+            <w:vAlign w:val="center"/>
+          </w:tcPr>
+          <w:p>
+            <w:pPr>
+              <w:jc w:val="center"/>
+            </w:pPr>
+            <w:r>
+              <w:rPr>
+                <w:rFonts w:ascii="Calibri" w:hAnsi="Calibri"/>
+                <w:sz w:val="19"/>
+              </w:rPr>
+              <w:t>+14.84 pp Net Gain</w:t>
+            </w:r>
+          </w:p>
+        </w:tc>
+      </w:tr>
+      <w:tr>
+        <w:tc>
+          <w:tcPr>
+            <w:tcW w:type="dxa" w:w="2880"/>
+            <w:shd w:fill="F8FAFC"/>
+            <w:tcMar>
+              <w:top w:w="100" w:type="dxa"/>
+              <w:bottom w:w="100" w:type="dxa"/>
+              <w:left w:w="160" w:type="dxa"/>
+              <w:right w:w="160" w:type="dxa"/>
+            </w:tcMar>
+            <w:vAlign w:val="center"/>
+          </w:tcPr>
+          <w:p>
+            <w:pPr>
+              <w:jc w:val="left"/>
+            </w:pPr>
+            <w:r>
+              <w:rPr>
+                <w:rFonts w:ascii="Calibri" w:hAnsi="Calibri"/>
+                <w:sz w:val="19"/>
+              </w:rPr>
+              <w:t>ARC-Easy (Elementary Science)</w:t>
+            </w:r>
+          </w:p>
+        </w:tc>
+        <w:tc>
+          <w:tcPr>
+            <w:tcW w:type="dxa" w:w="1296"/>
+            <w:shd w:fill="F8FAFC"/>
+            <w:tcMar>
+              <w:top w:w="100" w:type="dxa"/>
+              <w:bottom w:w="100" w:type="dxa"/>
+              <w:left w:w="160" w:type="dxa"/>
+              <w:right w:w="160" w:type="dxa"/>
+            </w:tcMar>
+            <w:vAlign w:val="center"/>
+          </w:tcPr>
+          <w:p>
+            <w:pPr>
+              <w:jc w:val="center"/>
+            </w:pPr>
+            <w:r>
+              <w:rPr>
+                <w:rFonts w:ascii="Calibri" w:hAnsi="Calibri"/>
+                <w:sz w:val="19"/>
+              </w:rPr>
+              <w:t>70.31%</w:t>
+            </w:r>
+          </w:p>
+        </w:tc>
+        <w:tc>
+          <w:tcPr>
+            <w:tcW w:type="dxa" w:w="1296"/>
+            <w:shd w:fill="F8FAFC"/>
+            <w:tcMar>
+              <w:top w:w="100" w:type="dxa"/>
+              <w:bottom w:w="100" w:type="dxa"/>
+              <w:left w:w="160" w:type="dxa"/>
+              <w:right w:w="160" w:type="dxa"/>
+            </w:tcMar>
+            <w:vAlign w:val="center"/>
+          </w:tcPr>
+          <w:p>
+            <w:pPr>
+              <w:jc w:val="center"/>
+            </w:pPr>
+            <w:r>
+              <w:rPr>
+                <w:rFonts w:ascii="Calibri" w:hAnsi="Calibri"/>
+                <w:sz w:val="19"/>
+              </w:rPr>
+              <w:t>65.62%</w:t>
+            </w:r>
+          </w:p>
+        </w:tc>
+        <w:tc>
+          <w:tcPr>
+            <w:tcW w:type="dxa" w:w="1296"/>
+            <w:shd w:fill="F8FAFC"/>
+            <w:tcMar>
+              <w:top w:w="100" w:type="dxa"/>
+              <w:bottom w:w="100" w:type="dxa"/>
+              <w:left w:w="160" w:type="dxa"/>
+              <w:right w:w="160" w:type="dxa"/>
+            </w:tcMar>
+            <w:vAlign w:val="center"/>
+          </w:tcPr>
+          <w:p>
+            <w:pPr>
+              <w:jc w:val="center"/>
+            </w:pPr>
+            <w:r>
+              <w:rPr>
+                <w:rFonts w:ascii="Calibri" w:hAnsi="Calibri"/>
+                <w:sz w:val="19"/>
+              </w:rPr>
+              <w:t>82.81%</w:t>
+            </w:r>
+          </w:p>
+        </w:tc>
+        <w:tc>
+          <w:tcPr>
+            <w:tcW w:type="dxa" w:w="1296"/>
+            <w:shd w:fill="F8FAFC"/>
+            <w:tcMar>
+              <w:top w:w="100" w:type="dxa"/>
+              <w:bottom w:w="100" w:type="dxa"/>
+              <w:left w:w="160" w:type="dxa"/>
+              <w:right w:w="160" w:type="dxa"/>
+            </w:tcMar>
+            <w:vAlign w:val="center"/>
+          </w:tcPr>
+          <w:p>
+            <w:pPr>
+              <w:jc w:val="center"/>
+            </w:pPr>
+            <w:r>
+              <w:rPr>
+                <w:rFonts w:ascii="Calibri" w:hAnsi="Calibri"/>
+                <w:sz w:val="19"/>
+              </w:rPr>
+              <w:t>67.19%</w:t>
+            </w:r>
+          </w:p>
+        </w:tc>
+        <w:tc>
+          <w:tcPr>
+            <w:tcW w:type="dxa" w:w="1728"/>
+            <w:shd w:fill="F8FAFC"/>
+            <w:tcMar>
+              <w:top w:w="100" w:type="dxa"/>
+              <w:bottom w:w="100" w:type="dxa"/>
+              <w:left w:w="160" w:type="dxa"/>
+              <w:right w:w="160" w:type="dxa"/>
+            </w:tcMar>
+            <w:vAlign w:val="center"/>
+          </w:tcPr>
+          <w:p>
+            <w:pPr>
+              <w:jc w:val="center"/>
+            </w:pPr>
+            <w:r>
+              <w:rPr>
+                <w:rFonts w:ascii="Calibri" w:hAnsi="Calibri"/>
+                <w:sz w:val="19"/>
+              </w:rPr>
+              <w:t>+12.5 pp at 100s</w:t>
+            </w:r>
+          </w:p>
+        </w:tc>
+      </w:tr>
+      <w:tr>
+        <w:tc>
+          <w:tcPr>
+            <w:tcW w:type="dxa" w:w="2880"/>
+            <w:shd w:fill="FFFFFF"/>
+            <w:tcMar>
+              <w:top w:w="100" w:type="dxa"/>
+              <w:bottom w:w="100" w:type="dxa"/>
+              <w:left w:w="160" w:type="dxa"/>
+              <w:right w:w="160" w:type="dxa"/>
+            </w:tcMar>
+            <w:vAlign w:val="center"/>
+          </w:tcPr>
+          <w:p>
+            <w:pPr>
+              <w:jc w:val="left"/>
+            </w:pPr>
+            <w:r>
+              <w:rPr>
+                <w:rFonts w:ascii="Calibri" w:hAnsi="Calibri"/>
+                <w:sz w:val="19"/>
+              </w:rPr>
+              <w:t>HellaSwag (Commonsense Reasoning)</w:t>
+            </w:r>
+          </w:p>
+        </w:tc>
+        <w:tc>
+          <w:tcPr>
+            <w:tcW w:type="dxa" w:w="1296"/>
+            <w:shd w:fill="FFFFFF"/>
+            <w:tcMar>
+              <w:top w:w="100" w:type="dxa"/>
+              <w:bottom w:w="100" w:type="dxa"/>
+              <w:left w:w="160" w:type="dxa"/>
+              <w:right w:w="160" w:type="dxa"/>
+            </w:tcMar>
+            <w:vAlign w:val="center"/>
+          </w:tcPr>
+          <w:p>
+            <w:pPr>
+              <w:jc w:val="center"/>
+            </w:pPr>
+            <w:r>
+              <w:rPr>
+                <w:rFonts w:ascii="Calibri" w:hAnsi="Calibri"/>
+                <w:sz w:val="19"/>
+              </w:rPr>
+              <w:t>23.44%</w:t>
+            </w:r>
+          </w:p>
+        </w:tc>
+        <w:tc>
+          <w:tcPr>
+            <w:tcW w:type="dxa" w:w="1296"/>
+            <w:shd w:fill="FFFFFF"/>
+            <w:tcMar>
+              <w:top w:w="100" w:type="dxa"/>
+              <w:bottom w:w="100" w:type="dxa"/>
+              <w:left w:w="160" w:type="dxa"/>
+              <w:right w:w="160" w:type="dxa"/>
+            </w:tcMar>
+            <w:vAlign w:val="center"/>
+          </w:tcPr>
+          <w:p>
+            <w:pPr>
+              <w:jc w:val="center"/>
+            </w:pPr>
+            <w:r>
+              <w:rPr>
+                <w:rFonts w:ascii="Calibri" w:hAnsi="Calibri"/>
+                <w:sz w:val="19"/>
+              </w:rPr>
+              <w:t>48.44%</w:t>
+            </w:r>
+          </w:p>
+        </w:tc>
+        <w:tc>
+          <w:tcPr>
+            <w:tcW w:type="dxa" w:w="1296"/>
+            <w:shd w:fill="FFFFFF"/>
+            <w:tcMar>
+              <w:top w:w="100" w:type="dxa"/>
+              <w:bottom w:w="100" w:type="dxa"/>
+              <w:left w:w="160" w:type="dxa"/>
+              <w:right w:w="160" w:type="dxa"/>
+            </w:tcMar>
+            <w:vAlign w:val="center"/>
+          </w:tcPr>
+          <w:p>
+            <w:pPr>
+              <w:jc w:val="center"/>
+            </w:pPr>
+            <w:r>
+              <w:rPr>
+                <w:rFonts w:ascii="Calibri" w:hAnsi="Calibri"/>
+                <w:sz w:val="19"/>
+              </w:rPr>
+              <w:t>43.75%</w:t>
+            </w:r>
+          </w:p>
+        </w:tc>
+        <w:tc>
+          <w:tcPr>
+            <w:tcW w:type="dxa" w:w="1296"/>
+            <w:shd w:fill="FFFFFF"/>
+            <w:tcMar>
+              <w:top w:w="100" w:type="dxa"/>
+              <w:bottom w:w="100" w:type="dxa"/>
+              <w:left w:w="160" w:type="dxa"/>
+              <w:right w:w="160" w:type="dxa"/>
+            </w:tcMar>
+            <w:vAlign w:val="center"/>
+          </w:tcPr>
+          <w:p>
+            <w:pPr>
+              <w:jc w:val="center"/>
+            </w:pPr>
+            <w:r>
+              <w:rPr>
+                <w:rFonts w:ascii="Calibri" w:hAnsi="Calibri"/>
+                <w:sz w:val="19"/>
+              </w:rPr>
+              <w:t>42.19%</w:t>
+            </w:r>
+          </w:p>
+        </w:tc>
+        <w:tc>
+          <w:tcPr>
+            <w:tcW w:type="dxa" w:w="1728"/>
+            <w:shd w:fill="FFFFFF"/>
+            <w:tcMar>
+              <w:top w:w="100" w:type="dxa"/>
+              <w:bottom w:w="100" w:type="dxa"/>
+              <w:left w:w="160" w:type="dxa"/>
+              <w:right w:w="160" w:type="dxa"/>
+            </w:tcMar>
+            <w:vAlign w:val="center"/>
+          </w:tcPr>
+          <w:p>
+            <w:pPr>
+              <w:jc w:val="center"/>
+            </w:pPr>
+            <w:r>
+              <w:rPr>
+                <w:rFonts w:ascii="Calibri" w:hAnsi="Calibri"/>
+                <w:sz w:val="19"/>
+              </w:rPr>
+              <w:t>+20.3 pp at 100s</w:t>
+            </w:r>
+          </w:p>
+        </w:tc>
+      </w:tr>
+      <w:tr>
+        <w:tc>
+          <w:tcPr>
+            <w:tcW w:type="dxa" w:w="2880"/>
+            <w:shd w:fill="F8FAFC"/>
+            <w:tcMar>
+              <w:top w:w="100" w:type="dxa"/>
+              <w:bottom w:w="100" w:type="dxa"/>
+              <w:left w:w="160" w:type="dxa"/>
+              <w:right w:w="160" w:type="dxa"/>
+            </w:tcMar>
+            <w:vAlign w:val="center"/>
+          </w:tcPr>
+          <w:p>
+            <w:pPr>
+              <w:jc w:val="left"/>
+            </w:pPr>
+            <w:r>
+              <w:rPr>
+                <w:rFonts w:ascii="Calibri" w:hAnsi="Calibri"/>
+                <w:sz w:val="19"/>
+              </w:rPr>
+              <w:t>MMLU (Academic Multitask Knowledge)</w:t>
+            </w:r>
+          </w:p>
+        </w:tc>
+        <w:tc>
+          <w:tcPr>
+            <w:tcW w:type="dxa" w:w="1296"/>
+            <w:shd w:fill="F8FAFC"/>
+            <w:tcMar>
+              <w:top w:w="100" w:type="dxa"/>
+              <w:bottom w:w="100" w:type="dxa"/>
+              <w:left w:w="160" w:type="dxa"/>
+              <w:right w:w="160" w:type="dxa"/>
+            </w:tcMar>
+            <w:vAlign w:val="center"/>
+          </w:tcPr>
+          <w:p>
+            <w:pPr>
+              <w:jc w:val="center"/>
+            </w:pPr>
+            <w:r>
+              <w:rPr>
+                <w:rFonts w:ascii="Calibri" w:hAnsi="Calibri"/>
+                <w:sz w:val="19"/>
+              </w:rPr>
+              <w:t>37.50%</w:t>
+            </w:r>
+          </w:p>
+        </w:tc>
+        <w:tc>
+          <w:tcPr>
+            <w:tcW w:type="dxa" w:w="1296"/>
+            <w:shd w:fill="F8FAFC"/>
+            <w:tcMar>
+              <w:top w:w="100" w:type="dxa"/>
+              <w:bottom w:w="100" w:type="dxa"/>
+              <w:left w:w="160" w:type="dxa"/>
+              <w:right w:w="160" w:type="dxa"/>
+            </w:tcMar>
+            <w:vAlign w:val="center"/>
+          </w:tcPr>
+          <w:p>
+            <w:pPr>
+              <w:jc w:val="center"/>
+            </w:pPr>
+            <w:r>
+              <w:rPr>
+                <w:rFonts w:ascii="Calibri" w:hAnsi="Calibri"/>
+                <w:sz w:val="19"/>
+              </w:rPr>
+              <w:t>26.56%</w:t>
+            </w:r>
+          </w:p>
+        </w:tc>
+        <w:tc>
+          <w:tcPr>
+            <w:tcW w:type="dxa" w:w="1296"/>
+            <w:shd w:fill="F8FAFC"/>
+            <w:tcMar>
+              <w:top w:w="100" w:type="dxa"/>
+              <w:bottom w:w="100" w:type="dxa"/>
+              <w:left w:w="160" w:type="dxa"/>
+              <w:right w:w="160" w:type="dxa"/>
+            </w:tcMar>
+            <w:vAlign w:val="center"/>
+          </w:tcPr>
+          <w:p>
+            <w:pPr>
+              <w:jc w:val="center"/>
+            </w:pPr>
+            <w:r>
+              <w:rPr>
+                <w:rFonts w:ascii="Calibri" w:hAnsi="Calibri"/>
+                <w:sz w:val="19"/>
+              </w:rPr>
+              <w:t>40.62%</w:t>
+            </w:r>
+          </w:p>
+        </w:tc>
+        <w:tc>
+          <w:tcPr>
+            <w:tcW w:type="dxa" w:w="1296"/>
+            <w:shd w:fill="F8FAFC"/>
+            <w:tcMar>
+              <w:top w:w="100" w:type="dxa"/>
+              <w:bottom w:w="100" w:type="dxa"/>
+              <w:left w:w="160" w:type="dxa"/>
+              <w:right w:w="160" w:type="dxa"/>
+            </w:tcMar>
+            <w:vAlign w:val="center"/>
+          </w:tcPr>
+          <w:p>
+            <w:pPr>
+              <w:jc w:val="center"/>
+            </w:pPr>
+            <w:r>
+              <w:rPr>
+                <w:rFonts w:ascii="Calibri" w:hAnsi="Calibri"/>
+                <w:sz w:val="19"/>
+              </w:rPr>
+              <w:t>29.69%</w:t>
+            </w:r>
+          </w:p>
+        </w:tc>
+        <w:tc>
+          <w:tcPr>
+            <w:tcW w:type="dxa" w:w="1728"/>
+            <w:shd w:fill="F8FAFC"/>
+            <w:tcMar>
+              <w:top w:w="100" w:type="dxa"/>
+              <w:bottom w:w="100" w:type="dxa"/>
+              <w:left w:w="160" w:type="dxa"/>
+              <w:right w:w="160" w:type="dxa"/>
+            </w:tcMar>
+            <w:vAlign w:val="center"/>
+          </w:tcPr>
+          <w:p>
+            <w:pPr>
+              <w:jc w:val="center"/>
+            </w:pPr>
+            <w:r>
+              <w:rPr>
+                <w:rFonts w:ascii="Calibri" w:hAnsi="Calibri"/>
+                <w:sz w:val="19"/>
+              </w:rPr>
+              <w:t>Consistently higher</w:t>
+            </w:r>
+          </w:p>
+        </w:tc>
+      </w:tr>
+      <w:tr>
+        <w:tc>
+          <w:tcPr>
+            <w:tcW w:type="dxa" w:w="2880"/>
+            <w:shd w:fill="FFFFFF"/>
+            <w:tcMar>
+              <w:top w:w="100" w:type="dxa"/>
+              <w:bottom w:w="100" w:type="dxa"/>
+              <w:left w:w="160" w:type="dxa"/>
+              <w:right w:w="160" w:type="dxa"/>
+            </w:tcMar>
+            <w:vAlign w:val="center"/>
+          </w:tcPr>
+          <w:p>
+            <w:pPr>
+              <w:jc w:val="left"/>
+            </w:pPr>
+            <w:r>
+              <w:rPr>
+                <w:rFonts w:ascii="Calibri" w:hAnsi="Calibri"/>
+                <w:sz w:val="19"/>
+              </w:rPr>
+              <w:t>IFEval Strict (Instruction Following)</w:t>
+            </w:r>
+          </w:p>
+        </w:tc>
+        <w:tc>
+          <w:tcPr>
+            <w:tcW w:type="dxa" w:w="1296"/>
+            <w:shd w:fill="FFFFFF"/>
+            <w:tcMar>
+              <w:top w:w="100" w:type="dxa"/>
+              <w:bottom w:w="100" w:type="dxa"/>
+              <w:left w:w="160" w:type="dxa"/>
+              <w:right w:w="160" w:type="dxa"/>
+            </w:tcMar>
+            <w:vAlign w:val="center"/>
+          </w:tcPr>
+          <w:p>
+            <w:pPr>
+              <w:jc w:val="center"/>
+            </w:pPr>
+            <w:r>
+              <w:rPr>
+                <w:rFonts w:ascii="Calibri" w:hAnsi="Calibri"/>
+                <w:sz w:val="19"/>
+              </w:rPr>
+              <w:t>14.06%</w:t>
+            </w:r>
+          </w:p>
+        </w:tc>
+        <w:tc>
+          <w:tcPr>
+            <w:tcW w:type="dxa" w:w="1296"/>
+            <w:shd w:fill="FFFFFF"/>
+            <w:tcMar>
+              <w:top w:w="100" w:type="dxa"/>
+              <w:bottom w:w="100" w:type="dxa"/>
+              <w:left w:w="160" w:type="dxa"/>
+              <w:right w:w="160" w:type="dxa"/>
+            </w:tcMar>
+            <w:vAlign w:val="center"/>
+          </w:tcPr>
+          <w:p>
+            <w:pPr>
+              <w:jc w:val="center"/>
+            </w:pPr>
+            <w:r>
+              <w:rPr>
+                <w:rFonts w:ascii="Calibri" w:hAnsi="Calibri"/>
+                <w:sz w:val="19"/>
+              </w:rPr>
+              <w:t>10.94%</w:t>
+            </w:r>
+          </w:p>
+        </w:tc>
+        <w:tc>
+          <w:tcPr>
+            <w:tcW w:type="dxa" w:w="1296"/>
+            <w:shd w:fill="FFFFFF"/>
+            <w:tcMar>
+              <w:top w:w="100" w:type="dxa"/>
+              <w:bottom w:w="100" w:type="dxa"/>
+              <w:left w:w="160" w:type="dxa"/>
+              <w:right w:w="160" w:type="dxa"/>
+            </w:tcMar>
+            <w:vAlign w:val="center"/>
+          </w:tcPr>
+          <w:p>
+            <w:pPr>
+              <w:jc w:val="center"/>
+            </w:pPr>
+            <w:r>
+              <w:rPr>
+                <w:rFonts w:ascii="Calibri" w:hAnsi="Calibri"/>
+                <w:sz w:val="19"/>
+              </w:rPr>
+              <w:t>10.94%</w:t>
+            </w:r>
+          </w:p>
+        </w:tc>
+        <w:tc>
+          <w:tcPr>
+            <w:tcW w:type="dxa" w:w="1296"/>
+            <w:shd w:fill="FFFFFF"/>
+            <w:tcMar>
+              <w:top w:w="100" w:type="dxa"/>
+              <w:bottom w:w="100" w:type="dxa"/>
+              <w:left w:w="160" w:type="dxa"/>
+              <w:right w:w="160" w:type="dxa"/>
+            </w:tcMar>
+            <w:vAlign w:val="center"/>
+          </w:tcPr>
+          <w:p>
+            <w:pPr>
+              <w:jc w:val="center"/>
+            </w:pPr>
+            <w:r>
+              <w:rPr>
+                <w:rFonts w:ascii="Calibri" w:hAnsi="Calibri"/>
+                <w:sz w:val="19"/>
+              </w:rPr>
+              <w:t>14.06%</w:t>
+            </w:r>
+          </w:p>
+        </w:tc>
+        <w:tc>
+          <w:tcPr>
+            <w:tcW w:type="dxa" w:w="1728"/>
+            <w:shd w:fill="FFFFFF"/>
+            <w:tcMar>
+              <w:top w:w="100" w:type="dxa"/>
+              <w:bottom w:w="100" w:type="dxa"/>
+              <w:left w:w="160" w:type="dxa"/>
+              <w:right w:w="160" w:type="dxa"/>
+            </w:tcMar>
+            <w:vAlign w:val="center"/>
+          </w:tcPr>
+          <w:p>
+            <w:pPr>
+              <w:jc w:val="center"/>
+            </w:pPr>
+            <w:r>
+              <w:rPr>
+                <w:rFonts w:ascii="Calibri" w:hAnsi="Calibri"/>
+                <w:sz w:val="19"/>
+              </w:rPr>
+              <w:t>+3.12 pp retention</w:t>
+            </w:r>
+          </w:p>
+        </w:tc>
+      </w:tr>
+      <w:tr>
+        <w:tc>
+          <w:tcPr>
+            <w:tcW w:type="dxa" w:w="2880"/>
+            <w:shd w:fill="F8FAFC"/>
+            <w:tcMar>
+              <w:top w:w="100" w:type="dxa"/>
+              <w:bottom w:w="100" w:type="dxa"/>
+              <w:left w:w="160" w:type="dxa"/>
+              <w:right w:w="160" w:type="dxa"/>
+            </w:tcMar>
+            <w:vAlign w:val="center"/>
+          </w:tcPr>
+          <w:p>
+            <w:pPr>
+              <w:jc w:val="left"/>
+            </w:pPr>
+            <w:r>
+              <w:rPr>
+                <w:rFonts w:ascii="Calibri" w:hAnsi="Calibri"/>
+                <w:sz w:val="19"/>
+              </w:rPr>
+              <w:t>WikiText-2 Perplexity (Language Fluency)</w:t>
+            </w:r>
+          </w:p>
+        </w:tc>
+        <w:tc>
+          <w:tcPr>
+            <w:tcW w:type="dxa" w:w="1296"/>
+            <w:shd w:fill="F8FAFC"/>
+            <w:tcMar>
+              <w:top w:w="100" w:type="dxa"/>
+              <w:bottom w:w="100" w:type="dxa"/>
+              <w:left w:w="160" w:type="dxa"/>
+              <w:right w:w="160" w:type="dxa"/>
+            </w:tcMar>
+            <w:vAlign w:val="center"/>
+          </w:tcPr>
+          <w:p>
+            <w:pPr>
+              <w:jc w:val="center"/>
+            </w:pPr>
+            <w:r>
+              <w:rPr>
+                <w:rFonts w:ascii="Calibri" w:hAnsi="Calibri"/>
+                <w:sz w:val="19"/>
+              </w:rPr>
+              <w:t>20.79</w:t>
+            </w:r>
+          </w:p>
+        </w:tc>
+        <w:tc>
+          <w:tcPr>
+            <w:tcW w:type="dxa" w:w="1296"/>
+            <w:shd w:fill="F8FAFC"/>
+            <w:tcMar>
+              <w:top w:w="100" w:type="dxa"/>
+              <w:bottom w:w="100" w:type="dxa"/>
+              <w:left w:w="160" w:type="dxa"/>
+              <w:right w:w="160" w:type="dxa"/>
+            </w:tcMar>
+            <w:vAlign w:val="center"/>
+          </w:tcPr>
+          <w:p>
+            <w:pPr>
+              <w:jc w:val="center"/>
+            </w:pPr>
+            <w:r>
+              <w:rPr>
+                <w:rFonts w:ascii="Calibri" w:hAnsi="Calibri"/>
+                <w:sz w:val="19"/>
+              </w:rPr>
+              <w:t>20.83</w:t>
+            </w:r>
+          </w:p>
+        </w:tc>
+        <w:tc>
+          <w:tcPr>
+            <w:tcW w:type="dxa" w:w="1296"/>
+            <w:shd w:fill="F8FAFC"/>
+            <w:tcMar>
+              <w:top w:w="100" w:type="dxa"/>
+              <w:bottom w:w="100" w:type="dxa"/>
+              <w:left w:w="160" w:type="dxa"/>
+              <w:right w:w="160" w:type="dxa"/>
+            </w:tcMar>
+            <w:vAlign w:val="center"/>
+          </w:tcPr>
+          <w:p>
+            <w:pPr>
+              <w:jc w:val="center"/>
+            </w:pPr>
+            <w:r>
+              <w:rPr>
+                <w:rFonts w:ascii="Calibri" w:hAnsi="Calibri"/>
+                <w:sz w:val="19"/>
+              </w:rPr>
+              <w:t>20.81</w:t>
+            </w:r>
+          </w:p>
+        </w:tc>
+        <w:tc>
+          <w:tcPr>
+            <w:tcW w:type="dxa" w:w="1296"/>
+            <w:shd w:fill="F8FAFC"/>
+            <w:tcMar>
+              <w:top w:w="100" w:type="dxa"/>
+              <w:bottom w:w="100" w:type="dxa"/>
+              <w:left w:w="160" w:type="dxa"/>
+              <w:right w:w="160" w:type="dxa"/>
+            </w:tcMar>
+            <w:vAlign w:val="center"/>
+          </w:tcPr>
+          <w:p>
+            <w:pPr>
+              <w:jc w:val="center"/>
+            </w:pPr>
+            <w:r>
+              <w:rPr>
+                <w:rFonts w:ascii="Calibri" w:hAnsi="Calibri"/>
+                <w:sz w:val="19"/>
+              </w:rPr>
+              <w:t>20.77</w:t>
+            </w:r>
+          </w:p>
+        </w:tc>
+        <w:tc>
+          <w:tcPr>
+            <w:tcW w:type="dxa" w:w="1728"/>
+            <w:shd w:fill="F8FAFC"/>
+            <w:tcMar>
+              <w:top w:w="100" w:type="dxa"/>
+              <w:bottom w:w="100" w:type="dxa"/>
+              <w:left w:w="160" w:type="dxa"/>
+              <w:right w:w="160" w:type="dxa"/>
+            </w:tcMar>
+            <w:vAlign w:val="center"/>
+          </w:tcPr>
+          <w:p>
+            <w:pPr>
+              <w:jc w:val="center"/>
+            </w:pPr>
+            <w:r>
+              <w:rPr>
+                <w:rFonts w:ascii="Calibri" w:hAnsi="Calibri"/>
+                <w:sz w:val="19"/>
+              </w:rPr>
+              <w:t>Lower PPL (Best Fluency)</w:t>
+            </w:r>
+          </w:p>
+        </w:tc>
+      </w:tr>
+    </w:tbl>
+    <w:p>
+      <w:pPr>
+        <w:spacing w:after="120"/>
+      </w:pPr>
+    </w:p>
+    <w:p>
+      <w:pPr>
         <w:spacing w:before="320" w:after="80"/>
       </w:pPr>
       <w:r>

</xml_diff>